<commit_message>
Update database and website according to 11 college DBMS practicals syllabus, add practicals lab page, MySQL script, and update project report
</commit_message>
<xml_diff>
--- a/QR_Cafe_Project_Report.docx
+++ b/QR_Cafe_Project_Report.docx
@@ -2776,7 +2776,26 @@
           <w:sz w:val="32"/>
           <w:szCs w:val="32"/>
         </w:rPr>
-        <w:t xml:space="preserve">CHAPTER 4: DATABASE SCHEMA &amp; DATA DICTIONARY</w:t>
+        <w:t xml:space="preserve">CHAPTER 4: DATABASE IMPLEMENTATION ACCORDING TO 11 LAB PRACTICALS</w:t>
+      </w:r>
+    </w:p>
+    <w:p>
+      <w:pPr>
+        <w:spacing w:after="120" w:before="120" w:line="276"/>
+        <w:jc w:val="left"/>
+      </w:pPr>
+      <w:r>
+        <w:rPr>
+          <w:rFonts w:ascii="Calibri" w:cs="Calibri" w:eastAsia="Calibri" w:hAnsi="Calibri"/>
+          <w:b w:val="false"/>
+          <w:bCs w:val="false"/>
+          <w:i w:val="false"/>
+          <w:iCs w:val="false"/>
+          <w:color w:val="1F2937"/>
+          <w:sz w:val="22"/>
+          <w:szCs w:val="22"/>
+        </w:rPr>
+        <w:t xml:space="preserve">The database for QR Cafe has been designed and implemented in strict compliance with the college syllabus list of 11 DBMS Lab Practicals:</w:t>
       </w:r>
     </w:p>
     <w:p>
@@ -2793,24 +2812,198 @@
           <w:sz w:val="26"/>
           <w:szCs w:val="26"/>
         </w:rPr>
-        <w:t xml:space="preserve">4.1 Table Specifications</w:t>
-      </w:r>
-    </w:p>
-    <w:p>
-      <w:pPr>
-        <w:pStyle w:val="Heading3"/>
-        <w:spacing w:after="80" w:before="180"/>
+        <w:t xml:space="preserve">4.1 Practical 1: Case Study of Database (QR Cafe System)</w:t>
+      </w:r>
+    </w:p>
+    <w:p>
+      <w:pPr>
+        <w:spacing w:after="120" w:before="120" w:line="276"/>
+        <w:jc w:val="left"/>
+      </w:pPr>
+      <w:r>
+        <w:rPr>
+          <w:rFonts w:ascii="Calibri" w:cs="Calibri" w:eastAsia="Calibri" w:hAnsi="Calibri"/>
+          <w:b w:val="false"/>
+          <w:bCs w:val="false"/>
+          <w:i w:val="false"/>
+          <w:iCs w:val="false"/>
+          <w:color w:val="1F2937"/>
+          <w:sz w:val="22"/>
+          <w:szCs w:val="22"/>
+        </w:rPr>
+        <w:t xml:space="preserve">Case study of a digital restaurant dining system eliminating physical paper menus. It incorporates 7 core entities: CAFE_TABLES, CUSTOMERS, BOOKINGS, MENU_ITEMS, CAFE_ORDERS, ORDER_ITEMS, and AUDIT_LOG.</w:t>
+      </w:r>
+    </w:p>
+    <w:p>
+      <w:pPr>
+        <w:pStyle w:val="Heading2"/>
+        <w:spacing w:after="120" w:before="240"/>
       </w:pPr>
       <w:r>
         <w:rPr>
           <w:rFonts w:ascii="Calibri" w:cs="Calibri" w:eastAsia="Calibri" w:hAnsi="Calibri"/>
           <w:b/>
           <w:bCs/>
+          <w:color w:val="3B82F6"/>
+          <w:sz w:val="26"/>
+          <w:szCs w:val="26"/>
+        </w:rPr>
+        <w:t xml:space="preserve">4.2 Practical 2: Data Definition Language (DDL)</w:t>
+      </w:r>
+    </w:p>
+    <w:p>
+      <w:pPr>
+        <w:spacing w:after="120" w:before="120" w:line="276"/>
+        <w:jc w:val="left"/>
+      </w:pPr>
+      <w:r>
+        <w:rPr>
+          <w:rFonts w:ascii="Calibri" w:cs="Calibri" w:eastAsia="Calibri" w:hAnsi="Calibri"/>
+          <w:b w:val="false"/>
+          <w:bCs w:val="false"/>
+          <w:i w:val="false"/>
+          <w:iCs w:val="false"/>
+          <w:color w:val="1F2937"/>
+          <w:sz w:val="22"/>
+          <w:szCs w:val="22"/>
+        </w:rPr>
+        <w:t xml:space="preserve">Implemented DDL commands for schema definition:</w:t>
+      </w:r>
+    </w:p>
+    <w:p>
+      <w:pPr>
+        <w:pStyle w:val="ListParagraph"/>
+        <w:numPr>
+          <w:ilvl w:val="0"/>
+          <w:numId w:val="1"/>
+        </w:numPr>
+        <w:spacing w:after="60" w:before="60" w:line="260"/>
+      </w:pPr>
+      <w:r>
+        <w:rPr>
+          <w:rFonts w:ascii="Calibri" w:cs="Calibri" w:eastAsia="Calibri" w:hAnsi="Calibri"/>
+          <w:b/>
+          <w:bCs/>
+          <w:color w:val="1F2937"/>
+          <w:sz w:val="22"/>
+          <w:szCs w:val="22"/>
+        </w:rPr>
+        <w:t xml:space="preserve">(a) </w:t>
+      </w:r>
+      <w:r>
+        <w:rPr>
+          <w:rFonts w:ascii="Calibri" w:cs="Calibri" w:eastAsia="Calibri" w:hAnsi="Calibri"/>
           <w:color w:val="374151"/>
-          <w:sz w:val="24"/>
-          <w:szCs w:val="24"/>
-        </w:rPr>
-        <w:t xml:space="preserve">Table 1: CAFE_TABLES</w:t>
+          <w:sz w:val="22"/>
+          <w:szCs w:val="22"/>
+        </w:rPr>
+        <w:t xml:space="preserve">CREATE TABLE: Creates the relational tables with data types, auto-incrementing surrogate keys, and field definitions.</w:t>
+      </w:r>
+    </w:p>
+    <w:p>
+      <w:pPr>
+        <w:pStyle w:val="ListParagraph"/>
+        <w:numPr>
+          <w:ilvl w:val="0"/>
+          <w:numId w:val="1"/>
+        </w:numPr>
+        <w:spacing w:after="60" w:before="60" w:line="260"/>
+      </w:pPr>
+      <w:r>
+        <w:rPr>
+          <w:rFonts w:ascii="Calibri" w:cs="Calibri" w:eastAsia="Calibri" w:hAnsi="Calibri"/>
+          <w:b/>
+          <w:bCs/>
+          <w:color w:val="1F2937"/>
+          <w:sz w:val="22"/>
+          <w:szCs w:val="22"/>
+        </w:rPr>
+        <w:t xml:space="preserve">(b) </w:t>
+      </w:r>
+      <w:r>
+        <w:rPr>
+          <w:rFonts w:ascii="Calibri" w:cs="Calibri" w:eastAsia="Calibri" w:hAnsi="Calibri"/>
+          <w:color w:val="374151"/>
+          <w:sz w:val="22"/>
+          <w:szCs w:val="22"/>
+        </w:rPr>
+        <w:t xml:space="preserve">ALTER TABLE: Used to extend schema without dropping data (e.g., adding floor_number to cafe_tables and modifying column widths).</w:t>
+      </w:r>
+    </w:p>
+    <w:p>
+      <w:pPr>
+        <w:pStyle w:val="ListParagraph"/>
+        <w:numPr>
+          <w:ilvl w:val="0"/>
+          <w:numId w:val="1"/>
+        </w:numPr>
+        <w:spacing w:after="60" w:before="60" w:line="260"/>
+      </w:pPr>
+      <w:r>
+        <w:rPr>
+          <w:rFonts w:ascii="Calibri" w:cs="Calibri" w:eastAsia="Calibri" w:hAnsi="Calibri"/>
+          <w:b/>
+          <w:bCs/>
+          <w:color w:val="1F2937"/>
+          <w:sz w:val="22"/>
+          <w:szCs w:val="22"/>
+        </w:rPr>
+        <w:t xml:space="preserve">(c) </w:t>
+      </w:r>
+      <w:r>
+        <w:rPr>
+          <w:rFonts w:ascii="Calibri" w:cs="Calibri" w:eastAsia="Calibri" w:hAnsi="Calibri"/>
+          <w:color w:val="374151"/>
+          <w:sz w:val="22"/>
+          <w:szCs w:val="22"/>
+        </w:rPr>
+        <w:t xml:space="preserve">DROP TABLE: Safe cleanup removing outdated or temporary relations.</w:t>
+      </w:r>
+    </w:p>
+    <w:p>
+      <w:pPr>
+        <w:pStyle w:val="ListParagraph"/>
+        <w:numPr>
+          <w:ilvl w:val="0"/>
+          <w:numId w:val="1"/>
+        </w:numPr>
+        <w:spacing w:after="60" w:before="60" w:line="260"/>
+      </w:pPr>
+      <w:r>
+        <w:rPr>
+          <w:rFonts w:ascii="Calibri" w:cs="Calibri" w:eastAsia="Calibri" w:hAnsi="Calibri"/>
+          <w:b/>
+          <w:bCs/>
+          <w:color w:val="1F2937"/>
+          <w:sz w:val="22"/>
+          <w:szCs w:val="22"/>
+        </w:rPr>
+        <w:t xml:space="preserve">(d) </w:t>
+      </w:r>
+      <w:r>
+        <w:rPr>
+          <w:rFonts w:ascii="Calibri" w:cs="Calibri" w:eastAsia="Calibri" w:hAnsi="Calibri"/>
+          <w:color w:val="374151"/>
+          <w:sz w:val="22"/>
+          <w:szCs w:val="22"/>
+        </w:rPr>
+        <w:t xml:space="preserve">TRUNCATE TABLE: Rapid deletion of all table tuples without destroying table structure.</w:t>
+      </w:r>
+    </w:p>
+    (t) =&gt; new Paragraph({ children: [new TextRun({ text: t, bold: true, size: 22, color: '1E3A8A' })], spacing: { before: 120, after: 60 } })
+    <w:p>
+      <w:pPr>
+        <w:spacing w:after="60" w:before="120"/>
+      </w:pPr>
+      <w:r>
+        <w:rPr>
+          <w:b/>
+          <w:bCs/>
+          <w:color w:val="1E3A8A"/>
+          <w:sz w:val="22"/>
+          <w:szCs w:val="22"/>
+        </w:rPr>
+        <w:t xml:space="preserve">1. CAFE_TABLES</w:t>
       </w:r>
     </w:p>
     <w:tbl>
@@ -3327,24 +3520,22 @@
     </w:tbl>
     <w:p>
       <w:pPr>
-        <w:spacing w:before="180"/>
-      </w:pPr>
-    </w:p>
-    <w:p>
-      <w:pPr>
-        <w:pStyle w:val="Heading3"/>
-        <w:spacing w:after="80" w:before="180"/>
-      </w:pPr>
-      <w:r>
-        <w:rPr>
-          <w:rFonts w:ascii="Calibri" w:cs="Calibri" w:eastAsia="Calibri" w:hAnsi="Calibri"/>
+        <w:spacing w:before="120"/>
+      </w:pPr>
+    </w:p>
+    <w:p>
+      <w:pPr>
+        <w:spacing w:after="60" w:before="120"/>
+      </w:pPr>
+      <w:r>
+        <w:rPr>
           <w:b/>
           <w:bCs/>
-          <w:color w:val="374151"/>
-          <w:sz w:val="24"/>
-          <w:szCs w:val="24"/>
-        </w:rPr>
-        <w:t xml:space="preserve">Table 2: CUSTOMERS</w:t>
+          <w:color w:val="1E3A8A"/>
+          <w:sz w:val="22"/>
+          <w:szCs w:val="22"/>
+        </w:rPr>
+        <w:t xml:space="preserve">2. CUSTOMERS</w:t>
       </w:r>
     </w:p>
     <w:tbl>
@@ -3955,24 +4146,22 @@
     </w:tbl>
     <w:p>
       <w:pPr>
-        <w:spacing w:before="180"/>
-      </w:pPr>
-    </w:p>
-    <w:p>
-      <w:pPr>
-        <w:pStyle w:val="Heading3"/>
-        <w:spacing w:after="80" w:before="180"/>
-      </w:pPr>
-      <w:r>
-        <w:rPr>
-          <w:rFonts w:ascii="Calibri" w:cs="Calibri" w:eastAsia="Calibri" w:hAnsi="Calibri"/>
+        <w:spacing w:before="120"/>
+      </w:pPr>
+    </w:p>
+    <w:p>
+      <w:pPr>
+        <w:spacing w:after="60" w:before="120"/>
+      </w:pPr>
+      <w:r>
+        <w:rPr>
           <w:b/>
           <w:bCs/>
-          <w:color w:val="374151"/>
-          <w:sz w:val="24"/>
-          <w:szCs w:val="24"/>
-        </w:rPr>
-        <w:t xml:space="preserve">Table 3: BOOKINGS</w:t>
+          <w:color w:val="1E3A8A"/>
+          <w:sz w:val="22"/>
+          <w:szCs w:val="22"/>
+        </w:rPr>
+        <w:t xml:space="preserve">3. BOOKINGS</w:t>
       </w:r>
     </w:p>
     <w:tbl>
@@ -4771,24 +4960,22 @@
     </w:tbl>
     <w:p>
       <w:pPr>
-        <w:spacing w:before="180"/>
-      </w:pPr>
-    </w:p>
-    <w:p>
-      <w:pPr>
-        <w:pStyle w:val="Heading3"/>
-        <w:spacing w:after="80" w:before="180"/>
-      </w:pPr>
-      <w:r>
-        <w:rPr>
-          <w:rFonts w:ascii="Calibri" w:cs="Calibri" w:eastAsia="Calibri" w:hAnsi="Calibri"/>
+        <w:spacing w:before="120"/>
+      </w:pPr>
+    </w:p>
+    <w:p>
+      <w:pPr>
+        <w:spacing w:after="60" w:before="120"/>
+      </w:pPr>
+      <w:r>
+        <w:rPr>
           <w:b/>
           <w:bCs/>
-          <w:color w:val="374151"/>
-          <w:sz w:val="24"/>
-          <w:szCs w:val="24"/>
-        </w:rPr>
-        <w:t xml:space="preserve">Table 4: MENU_ITEMS</w:t>
+          <w:color w:val="1E3A8A"/>
+          <w:sz w:val="22"/>
+          <w:szCs w:val="22"/>
+        </w:rPr>
+        <w:t xml:space="preserve">4. MENU_ITEMS</w:t>
       </w:r>
     </w:p>
     <w:tbl>
@@ -5493,24 +5680,22 @@
     </w:tbl>
     <w:p>
       <w:pPr>
-        <w:spacing w:before="180"/>
-      </w:pPr>
-    </w:p>
-    <w:p>
-      <w:pPr>
-        <w:pStyle w:val="Heading3"/>
-        <w:spacing w:after="80" w:before="180"/>
-      </w:pPr>
-      <w:r>
-        <w:rPr>
-          <w:rFonts w:ascii="Calibri" w:cs="Calibri" w:eastAsia="Calibri" w:hAnsi="Calibri"/>
+        <w:spacing w:before="120"/>
+      </w:pPr>
+    </w:p>
+    <w:p>
+      <w:pPr>
+        <w:spacing w:after="60" w:before="120"/>
+      </w:pPr>
+      <w:r>
+        <w:rPr>
           <w:b/>
           <w:bCs/>
-          <w:color w:val="374151"/>
-          <w:sz w:val="24"/>
-          <w:szCs w:val="24"/>
-        </w:rPr>
-        <w:t xml:space="preserve">Table 5: CAFE_ORDERS</w:t>
+          <w:color w:val="1E3A8A"/>
+          <w:sz w:val="22"/>
+          <w:szCs w:val="22"/>
+        </w:rPr>
+        <w:t xml:space="preserve">5. CAFE_ORDERS</w:t>
       </w:r>
     </w:p>
     <w:tbl>
@@ -6309,24 +6494,22 @@
     </w:tbl>
     <w:p>
       <w:pPr>
-        <w:spacing w:before="180"/>
-      </w:pPr>
-    </w:p>
-    <w:p>
-      <w:pPr>
-        <w:pStyle w:val="Heading3"/>
-        <w:spacing w:after="80" w:before="180"/>
-      </w:pPr>
-      <w:r>
-        <w:rPr>
-          <w:rFonts w:ascii="Calibri" w:cs="Calibri" w:eastAsia="Calibri" w:hAnsi="Calibri"/>
+        <w:spacing w:before="120"/>
+      </w:pPr>
+    </w:p>
+    <w:p>
+      <w:pPr>
+        <w:spacing w:after="60" w:before="120"/>
+      </w:pPr>
+      <w:r>
+        <w:rPr>
           <w:b/>
           <w:bCs/>
-          <w:color w:val="374151"/>
-          <w:sz w:val="24"/>
-          <w:szCs w:val="24"/>
-        </w:rPr>
-        <w:t xml:space="preserve">Table 6: ORDER_ITEMS</w:t>
+          <w:color w:val="1E3A8A"/>
+          <w:sz w:val="22"/>
+          <w:szCs w:val="22"/>
+        </w:rPr>
+        <w:t xml:space="preserve">6. ORDER_ITEMS</w:t>
       </w:r>
     </w:p>
     <w:tbl>
@@ -6937,24 +7120,22 @@
     </w:tbl>
     <w:p>
       <w:pPr>
-        <w:spacing w:before="180"/>
-      </w:pPr>
-    </w:p>
-    <w:p>
-      <w:pPr>
-        <w:pStyle w:val="Heading3"/>
-        <w:spacing w:after="80" w:before="180"/>
-      </w:pPr>
-      <w:r>
-        <w:rPr>
-          <w:rFonts w:ascii="Calibri" w:cs="Calibri" w:eastAsia="Calibri" w:hAnsi="Calibri"/>
+        <w:spacing w:before="120"/>
+      </w:pPr>
+    </w:p>
+    <w:p>
+      <w:pPr>
+        <w:spacing w:after="60" w:before="120"/>
+      </w:pPr>
+      <w:r>
+        <w:rPr>
           <w:b/>
           <w:bCs/>
-          <w:color w:val="374151"/>
-          <w:sz w:val="24"/>
-          <w:szCs w:val="24"/>
-        </w:rPr>
-        <w:t xml:space="preserve">Table 7: AUDIT_LOG</w:t>
+          <w:color w:val="1E3A8A"/>
+          <w:sz w:val="22"/>
+          <w:szCs w:val="22"/>
+        </w:rPr>
+        <w:t xml:space="preserve">7. AUDIT_LOG</w:t>
       </w:r>
     </w:p>
     <w:tbl>
@@ -7563,6 +7744,1146 @@
         </w:tc>
       </w:tr>
     </w:tbl>
+    <w:p>
+      <w:pPr>
+        <w:pStyle w:val="Heading2"/>
+        <w:spacing w:after="120" w:before="240"/>
+      </w:pPr>
+      <w:r>
+        <w:rPr>
+          <w:rFonts w:ascii="Calibri" w:cs="Calibri" w:eastAsia="Calibri" w:hAnsi="Calibri"/>
+          <w:b/>
+          <w:bCs/>
+          <w:color w:val="3B82F6"/>
+          <w:sz w:val="26"/>
+          <w:szCs w:val="26"/>
+        </w:rPr>
+        <w:t xml:space="preserve">4.3 Practical 3: Data Manipulation Language (DML)</w:t>
+      </w:r>
+    </w:p>
+    <w:p>
+      <w:pPr>
+        <w:pStyle w:val="ListParagraph"/>
+        <w:numPr>
+          <w:ilvl w:val="0"/>
+          <w:numId w:val="1"/>
+        </w:numPr>
+        <w:spacing w:after="60" w:before="60" w:line="260"/>
+      </w:pPr>
+      <w:r>
+        <w:rPr>
+          <w:rFonts w:ascii="Calibri" w:cs="Calibri" w:eastAsia="Calibri" w:hAnsi="Calibri"/>
+          <w:b/>
+          <w:bCs/>
+          <w:color w:val="1F2937"/>
+          <w:sz w:val="22"/>
+          <w:szCs w:val="22"/>
+        </w:rPr>
+        <w:t xml:space="preserve">(a) </w:t>
+      </w:r>
+      <w:r>
+        <w:rPr>
+          <w:rFonts w:ascii="Calibri" w:cs="Calibri" w:eastAsia="Calibri" w:hAnsi="Calibri"/>
+          <w:color w:val="374151"/>
+          <w:sz w:val="22"/>
+          <w:szCs w:val="22"/>
+        </w:rPr>
+        <w:t xml:space="preserve">INSERT: Adding records into menu_items, customers, bookings, and cafe_orders.</w:t>
+      </w:r>
+    </w:p>
+    <w:p>
+      <w:pPr>
+        <w:pStyle w:val="ListParagraph"/>
+        <w:numPr>
+          <w:ilvl w:val="0"/>
+          <w:numId w:val="1"/>
+        </w:numPr>
+        <w:spacing w:after="60" w:before="60" w:line="260"/>
+      </w:pPr>
+      <w:r>
+        <w:rPr>
+          <w:rFonts w:ascii="Calibri" w:cs="Calibri" w:eastAsia="Calibri" w:hAnsi="Calibri"/>
+          <w:b/>
+          <w:bCs/>
+          <w:color w:val="1F2937"/>
+          <w:sz w:val="22"/>
+          <w:szCs w:val="22"/>
+        </w:rPr>
+        <w:t xml:space="preserve">(b) </w:t>
+      </w:r>
+      <w:r>
+        <w:rPr>
+          <w:rFonts w:ascii="Calibri" w:cs="Calibri" w:eastAsia="Calibri" w:hAnsi="Calibri"/>
+          <w:color w:val="374151"/>
+          <w:sz w:val="22"/>
+          <w:szCs w:val="22"/>
+        </w:rPr>
+        <w:t xml:space="preserve">SELECT: Querying active dishes, available tables, and customer order history.</w:t>
+      </w:r>
+    </w:p>
+    <w:p>
+      <w:pPr>
+        <w:pStyle w:val="ListParagraph"/>
+        <w:numPr>
+          <w:ilvl w:val="0"/>
+          <w:numId w:val="1"/>
+        </w:numPr>
+        <w:spacing w:after="60" w:before="60" w:line="260"/>
+      </w:pPr>
+      <w:r>
+        <w:rPr>
+          <w:rFonts w:ascii="Calibri" w:cs="Calibri" w:eastAsia="Calibri" w:hAnsi="Calibri"/>
+          <w:b/>
+          <w:bCs/>
+          <w:color w:val="1F2937"/>
+          <w:sz w:val="22"/>
+          <w:szCs w:val="22"/>
+        </w:rPr>
+        <w:t xml:space="preserve">(c) </w:t>
+      </w:r>
+      <w:r>
+        <w:rPr>
+          <w:rFonts w:ascii="Calibri" w:cs="Calibri" w:eastAsia="Calibri" w:hAnsi="Calibri"/>
+          <w:color w:val="374151"/>
+          <w:sz w:val="22"/>
+          <w:szCs w:val="22"/>
+        </w:rPr>
+        <w:t xml:space="preserve">UPDATE: Modifying customer contact details, item prices, and order statuses (PLACED -&gt; PREPARING -&gt; SERVED).</w:t>
+      </w:r>
+    </w:p>
+    <w:p>
+      <w:pPr>
+        <w:pStyle w:val="ListParagraph"/>
+        <w:numPr>
+          <w:ilvl w:val="0"/>
+          <w:numId w:val="1"/>
+        </w:numPr>
+        <w:spacing w:after="60" w:before="60" w:line="260"/>
+      </w:pPr>
+      <w:r>
+        <w:rPr>
+          <w:rFonts w:ascii="Calibri" w:cs="Calibri" w:eastAsia="Calibri" w:hAnsi="Calibri"/>
+          <w:b/>
+          <w:bCs/>
+          <w:color w:val="1F2937"/>
+          <w:sz w:val="22"/>
+          <w:szCs w:val="22"/>
+        </w:rPr>
+        <w:t xml:space="preserve">(d) </w:t>
+      </w:r>
+      <w:r>
+        <w:rPr>
+          <w:rFonts w:ascii="Calibri" w:cs="Calibri" w:eastAsia="Calibri" w:hAnsi="Calibri"/>
+          <w:color w:val="374151"/>
+          <w:sz w:val="22"/>
+          <w:szCs w:val="22"/>
+        </w:rPr>
+        <w:t xml:space="preserve">DELETE: Removing cancelled orders, expired items, and sample testing records.</w:t>
+      </w:r>
+    </w:p>
+    <w:p>
+      <w:pPr>
+        <w:pStyle w:val="ListParagraph"/>
+        <w:numPr>
+          <w:ilvl w:val="0"/>
+          <w:numId w:val="1"/>
+        </w:numPr>
+        <w:spacing w:after="60" w:before="60" w:line="260"/>
+      </w:pPr>
+      <w:r>
+        <w:rPr>
+          <w:rFonts w:ascii="Calibri" w:cs="Calibri" w:eastAsia="Calibri" w:hAnsi="Calibri"/>
+          <w:b/>
+          <w:bCs/>
+          <w:color w:val="1F2937"/>
+          <w:sz w:val="22"/>
+          <w:szCs w:val="22"/>
+        </w:rPr>
+        <w:t xml:space="preserve">(e) </w:t>
+      </w:r>
+      <w:r>
+        <w:rPr>
+          <w:rFonts w:ascii="Calibri" w:cs="Calibri" w:eastAsia="Calibri" w:hAnsi="Calibri"/>
+          <w:color w:val="374151"/>
+          <w:sz w:val="22"/>
+          <w:szCs w:val="22"/>
+        </w:rPr>
+        <w:t xml:space="preserve">LIKE '%': Wildcard pattern matching (e.g., `WHERE item_name LIKE '%Coffee%'` or `customer_name LIKE 'P%'`).</w:t>
+      </w:r>
+    </w:p>
+    <w:p>
+      <w:pPr>
+        <w:pStyle w:val="ListParagraph"/>
+        <w:numPr>
+          <w:ilvl w:val="0"/>
+          <w:numId w:val="1"/>
+        </w:numPr>
+        <w:spacing w:after="60" w:before="60" w:line="260"/>
+      </w:pPr>
+      <w:r>
+        <w:rPr>
+          <w:rFonts w:ascii="Calibri" w:cs="Calibri" w:eastAsia="Calibri" w:hAnsi="Calibri"/>
+          <w:b/>
+          <w:bCs/>
+          <w:color w:val="1F2937"/>
+          <w:sz w:val="22"/>
+          <w:szCs w:val="22"/>
+        </w:rPr>
+        <w:t xml:space="preserve">(f) </w:t>
+      </w:r>
+      <w:r>
+        <w:rPr>
+          <w:rFonts w:ascii="Calibri" w:cs="Calibri" w:eastAsia="Calibri" w:hAnsi="Calibri"/>
+          <w:color w:val="374151"/>
+          <w:sz w:val="22"/>
+          <w:szCs w:val="22"/>
+        </w:rPr>
+        <w:t xml:space="preserve">Relational Operators: Domain filtering using `=`, `!=`, `&gt;`, `&lt;`, `&gt;=`, `&lt;=` (e.g., `WHERE price &gt;= 140.00`).</w:t>
+      </w:r>
+    </w:p>
+    <w:p>
+      <w:pPr>
+        <w:pStyle w:val="Heading2"/>
+        <w:spacing w:after="120" w:before="240"/>
+      </w:pPr>
+      <w:r>
+        <w:rPr>
+          <w:rFonts w:ascii="Calibri" w:cs="Calibri" w:eastAsia="Calibri" w:hAnsi="Calibri"/>
+          <w:b/>
+          <w:bCs/>
+          <w:color w:val="3B82F6"/>
+          <w:sz w:val="26"/>
+          <w:szCs w:val="26"/>
+        </w:rPr>
+        <w:t xml:space="preserve">4.4 Practical 4: Integrity Constraints</w:t>
+      </w:r>
+    </w:p>
+    <w:p>
+      <w:pPr>
+        <w:pStyle w:val="ListParagraph"/>
+        <w:numPr>
+          <w:ilvl w:val="0"/>
+          <w:numId w:val="1"/>
+        </w:numPr>
+        <w:spacing w:after="60" w:before="60" w:line="260"/>
+      </w:pPr>
+      <w:r>
+        <w:rPr>
+          <w:rFonts w:ascii="Calibri" w:cs="Calibri" w:eastAsia="Calibri" w:hAnsi="Calibri"/>
+          <w:b/>
+          <w:bCs/>
+          <w:color w:val="1F2937"/>
+          <w:sz w:val="22"/>
+          <w:szCs w:val="22"/>
+        </w:rPr>
+        <w:t xml:space="preserve">• </w:t>
+      </w:r>
+      <w:r>
+        <w:rPr>
+          <w:rFonts w:ascii="Calibri" w:cs="Calibri" w:eastAsia="Calibri" w:hAnsi="Calibri"/>
+          <w:color w:val="374151"/>
+          <w:sz w:val="22"/>
+          <w:szCs w:val="22"/>
+        </w:rPr>
+        <w:t xml:space="preserve">PRIMARY KEY: Guaranteed unique tuple identification on all 7 entities.</w:t>
+      </w:r>
+    </w:p>
+    <w:p>
+      <w:pPr>
+        <w:pStyle w:val="ListParagraph"/>
+        <w:numPr>
+          <w:ilvl w:val="0"/>
+          <w:numId w:val="1"/>
+        </w:numPr>
+        <w:spacing w:after="60" w:before="60" w:line="260"/>
+      </w:pPr>
+      <w:r>
+        <w:rPr>
+          <w:rFonts w:ascii="Calibri" w:cs="Calibri" w:eastAsia="Calibri" w:hAnsi="Calibri"/>
+          <w:b/>
+          <w:bCs/>
+          <w:color w:val="1F2937"/>
+          <w:sz w:val="22"/>
+          <w:szCs w:val="22"/>
+        </w:rPr>
+        <w:t xml:space="preserve">• </w:t>
+      </w:r>
+      <w:r>
+        <w:rPr>
+          <w:rFonts w:ascii="Calibri" w:cs="Calibri" w:eastAsia="Calibri" w:hAnsi="Calibri"/>
+          <w:color w:val="374151"/>
+          <w:sz w:val="22"/>
+          <w:szCs w:val="22"/>
+        </w:rPr>
+        <w:t xml:space="preserve">FOREIGN KEY (ON DELETE CASCADE): Enforces referential integrity between orders, bookings, and items.</w:t>
+      </w:r>
+    </w:p>
+    <w:p>
+      <w:pPr>
+        <w:pStyle w:val="ListParagraph"/>
+        <w:numPr>
+          <w:ilvl w:val="0"/>
+          <w:numId w:val="1"/>
+        </w:numPr>
+        <w:spacing w:after="60" w:before="60" w:line="260"/>
+      </w:pPr>
+      <w:r>
+        <w:rPr>
+          <w:rFonts w:ascii="Calibri" w:cs="Calibri" w:eastAsia="Calibri" w:hAnsi="Calibri"/>
+          <w:b/>
+          <w:bCs/>
+          <w:color w:val="1F2937"/>
+          <w:sz w:val="22"/>
+          <w:szCs w:val="22"/>
+        </w:rPr>
+        <w:t xml:space="preserve">• </w:t>
+      </w:r>
+      <w:r>
+        <w:rPr>
+          <w:rFonts w:ascii="Calibri" w:cs="Calibri" w:eastAsia="Calibri" w:hAnsi="Calibri"/>
+          <w:color w:val="374151"/>
+          <w:sz w:val="22"/>
+          <w:szCs w:val="22"/>
+        </w:rPr>
+        <w:t xml:space="preserve">UNIQUE: Enforced on customer phone numbers, table numbers, and menu titles to prevent duplicates.</w:t>
+      </w:r>
+    </w:p>
+    <w:p>
+      <w:pPr>
+        <w:pStyle w:val="ListParagraph"/>
+        <w:numPr>
+          <w:ilvl w:val="0"/>
+          <w:numId w:val="1"/>
+        </w:numPr>
+        <w:spacing w:after="60" w:before="60" w:line="260"/>
+      </w:pPr>
+      <w:r>
+        <w:rPr>
+          <w:rFonts w:ascii="Calibri" w:cs="Calibri" w:eastAsia="Calibri" w:hAnsi="Calibri"/>
+          <w:b/>
+          <w:bCs/>
+          <w:color w:val="1F2937"/>
+          <w:sz w:val="22"/>
+          <w:szCs w:val="22"/>
+        </w:rPr>
+        <w:t xml:space="preserve">• </w:t>
+      </w:r>
+      <w:r>
+        <w:rPr>
+          <w:rFonts w:ascii="Calibri" w:cs="Calibri" w:eastAsia="Calibri" w:hAnsi="Calibri"/>
+          <w:color w:val="374151"/>
+          <w:sz w:val="22"/>
+          <w:szCs w:val="22"/>
+        </w:rPr>
+        <w:t xml:space="preserve">CHECK CONSTRAINTS: Enforced on capacity &gt; 0, price &gt;= 0, quantity &gt; 0, and customer age &gt;= 18.</w:t>
+      </w:r>
+    </w:p>
+    <w:p>
+      <w:pPr>
+        <w:pStyle w:val="ListParagraph"/>
+        <w:numPr>
+          <w:ilvl w:val="0"/>
+          <w:numId w:val="1"/>
+        </w:numPr>
+        <w:spacing w:after="60" w:before="60" w:line="260"/>
+      </w:pPr>
+      <w:r>
+        <w:rPr>
+          <w:rFonts w:ascii="Calibri" w:cs="Calibri" w:eastAsia="Calibri" w:hAnsi="Calibri"/>
+          <w:b/>
+          <w:bCs/>
+          <w:color w:val="1F2937"/>
+          <w:sz w:val="22"/>
+          <w:szCs w:val="22"/>
+        </w:rPr>
+        <w:t xml:space="preserve">• </w:t>
+      </w:r>
+      <w:r>
+        <w:rPr>
+          <w:rFonts w:ascii="Calibri" w:cs="Calibri" w:eastAsia="Calibri" w:hAnsi="Calibri"/>
+          <w:color w:val="374151"/>
+          <w:sz w:val="22"/>
+          <w:szCs w:val="22"/>
+        </w:rPr>
+        <w:t xml:space="preserve">DEFAULT CONSTRAINTS: Pre-populating default seating capacity (2), table status ('AVAILABLE'), and order status ('PLACED').</w:t>
+      </w:r>
+    </w:p>
+    <w:p>
+      <w:pPr>
+        <w:pStyle w:val="ListParagraph"/>
+        <w:numPr>
+          <w:ilvl w:val="0"/>
+          <w:numId w:val="1"/>
+        </w:numPr>
+        <w:spacing w:after="60" w:before="60" w:line="260"/>
+      </w:pPr>
+      <w:r>
+        <w:rPr>
+          <w:rFonts w:ascii="Calibri" w:cs="Calibri" w:eastAsia="Calibri" w:hAnsi="Calibri"/>
+          <w:b/>
+          <w:bCs/>
+          <w:color w:val="1F2937"/>
+          <w:sz w:val="22"/>
+          <w:szCs w:val="22"/>
+        </w:rPr>
+        <w:t xml:space="preserve">• </w:t>
+      </w:r>
+      <w:r>
+        <w:rPr>
+          <w:rFonts w:ascii="Calibri" w:cs="Calibri" w:eastAsia="Calibri" w:hAnsi="Calibri"/>
+          <w:color w:val="374151"/>
+          <w:sz w:val="22"/>
+          <w:szCs w:val="22"/>
+        </w:rPr>
+        <w:t xml:space="preserve">ENABLE / DISABLE / DROP CONSTRAINTS: Demonstrating constraint management syntax.</w:t>
+      </w:r>
+    </w:p>
+    <w:p>
+      <w:pPr>
+        <w:pStyle w:val="Heading2"/>
+        <w:spacing w:after="120" w:before="240"/>
+      </w:pPr>
+      <w:r>
+        <w:rPr>
+          <w:rFonts w:ascii="Calibri" w:cs="Calibri" w:eastAsia="Calibri" w:hAnsi="Calibri"/>
+          <w:b/>
+          <w:bCs/>
+          <w:color w:val="3B82F6"/>
+          <w:sz w:val="26"/>
+          <w:szCs w:val="26"/>
+        </w:rPr>
+        <w:t xml:space="preserve">4.5 Practical 5: Relational Joins</w:t>
+      </w:r>
+    </w:p>
+    <w:p>
+      <w:pPr>
+        <w:pStyle w:val="ListParagraph"/>
+        <w:numPr>
+          <w:ilvl w:val="0"/>
+          <w:numId w:val="1"/>
+        </w:numPr>
+        <w:spacing w:after="60" w:before="60" w:line="260"/>
+      </w:pPr>
+      <w:r>
+        <w:rPr>
+          <w:rFonts w:ascii="Calibri" w:cs="Calibri" w:eastAsia="Calibri" w:hAnsi="Calibri"/>
+          <w:b/>
+          <w:bCs/>
+          <w:color w:val="1F2937"/>
+          <w:sz w:val="22"/>
+          <w:szCs w:val="22"/>
+        </w:rPr>
+        <w:t xml:space="preserve">(a) </w:t>
+      </w:r>
+      <w:r>
+        <w:rPr>
+          <w:rFonts w:ascii="Calibri" w:cs="Calibri" w:eastAsia="Calibri" w:hAnsi="Calibri"/>
+          <w:color w:val="374151"/>
+          <w:sz w:val="22"/>
+          <w:szCs w:val="22"/>
+        </w:rPr>
+        <w:t xml:space="preserve">INNER JOIN: Matches bookings with customers and tables to produce comprehensive reservation slips.</w:t>
+      </w:r>
+    </w:p>
+    <w:p>
+      <w:pPr>
+        <w:pStyle w:val="ListParagraph"/>
+        <w:numPr>
+          <w:ilvl w:val="0"/>
+          <w:numId w:val="1"/>
+        </w:numPr>
+        <w:spacing w:after="60" w:before="60" w:line="260"/>
+      </w:pPr>
+      <w:r>
+        <w:rPr>
+          <w:rFonts w:ascii="Calibri" w:cs="Calibri" w:eastAsia="Calibri" w:hAnsi="Calibri"/>
+          <w:b/>
+          <w:bCs/>
+          <w:color w:val="1F2937"/>
+          <w:sz w:val="22"/>
+          <w:szCs w:val="22"/>
+        </w:rPr>
+        <w:t xml:space="preserve">(b) </w:t>
+      </w:r>
+      <w:r>
+        <w:rPr>
+          <w:rFonts w:ascii="Calibri" w:cs="Calibri" w:eastAsia="Calibri" w:hAnsi="Calibri"/>
+          <w:color w:val="374151"/>
+          <w:sz w:val="22"/>
+          <w:szCs w:val="22"/>
+        </w:rPr>
+        <w:t xml:space="preserve">LEFT JOIN: Selects all cafe tables alongside bookings, preserving unreserved tables as NULL.</w:t>
+      </w:r>
+    </w:p>
+    <w:p>
+      <w:pPr>
+        <w:pStyle w:val="ListParagraph"/>
+        <w:numPr>
+          <w:ilvl w:val="0"/>
+          <w:numId w:val="1"/>
+        </w:numPr>
+        <w:spacing w:after="60" w:before="60" w:line="260"/>
+      </w:pPr>
+      <w:r>
+        <w:rPr>
+          <w:rFonts w:ascii="Calibri" w:cs="Calibri" w:eastAsia="Calibri" w:hAnsi="Calibri"/>
+          <w:b/>
+          <w:bCs/>
+          <w:color w:val="1F2937"/>
+          <w:sz w:val="22"/>
+          <w:szCs w:val="22"/>
+        </w:rPr>
+        <w:t xml:space="preserve">(c) </w:t>
+      </w:r>
+      <w:r>
+        <w:rPr>
+          <w:rFonts w:ascii="Calibri" w:cs="Calibri" w:eastAsia="Calibri" w:hAnsi="Calibri"/>
+          <w:color w:val="374151"/>
+          <w:sz w:val="22"/>
+          <w:szCs w:val="22"/>
+        </w:rPr>
+        <w:t xml:space="preserve">RIGHT JOIN: Selects all registered customers along with any reservation contracts they hold.</w:t>
+      </w:r>
+    </w:p>
+    <w:p>
+      <w:pPr>
+        <w:pStyle w:val="ListParagraph"/>
+        <w:numPr>
+          <w:ilvl w:val="0"/>
+          <w:numId w:val="1"/>
+        </w:numPr>
+        <w:spacing w:after="60" w:before="60" w:line="260"/>
+      </w:pPr>
+      <w:r>
+        <w:rPr>
+          <w:rFonts w:ascii="Calibri" w:cs="Calibri" w:eastAsia="Calibri" w:hAnsi="Calibri"/>
+          <w:b/>
+          <w:bCs/>
+          <w:color w:val="1F2937"/>
+          <w:sz w:val="22"/>
+          <w:szCs w:val="22"/>
+        </w:rPr>
+        <w:t xml:space="preserve">(d) </w:t>
+      </w:r>
+      <w:r>
+        <w:rPr>
+          <w:rFonts w:ascii="Calibri" w:cs="Calibri" w:eastAsia="Calibri" w:hAnsi="Calibri"/>
+          <w:color w:val="374151"/>
+          <w:sz w:val="22"/>
+          <w:szCs w:val="22"/>
+        </w:rPr>
+        <w:t xml:space="preserve">FULL JOIN (UNION): Matches all tables and reservations comprehensively.</w:t>
+      </w:r>
+    </w:p>
+    <w:p>
+      <w:pPr>
+        <w:pStyle w:val="Heading2"/>
+        <w:spacing w:after="120" w:before="240"/>
+      </w:pPr>
+      <w:r>
+        <w:rPr>
+          <w:rFonts w:ascii="Calibri" w:cs="Calibri" w:eastAsia="Calibri" w:hAnsi="Calibri"/>
+          <w:b/>
+          <w:bCs/>
+          <w:color w:val="3B82F6"/>
+          <w:sz w:val="26"/>
+          <w:szCs w:val="26"/>
+        </w:rPr>
+        <w:t xml:space="preserve">4.6 Practical 6: Nested Subqueries</w:t>
+      </w:r>
+    </w:p>
+    <w:p>
+      <w:pPr>
+        <w:pStyle w:val="ListParagraph"/>
+        <w:numPr>
+          <w:ilvl w:val="0"/>
+          <w:numId w:val="1"/>
+        </w:numPr>
+        <w:spacing w:after="60" w:before="60" w:line="260"/>
+      </w:pPr>
+      <w:r>
+        <w:rPr>
+          <w:rFonts w:ascii="Calibri" w:cs="Calibri" w:eastAsia="Calibri" w:hAnsi="Calibri"/>
+          <w:b/>
+          <w:bCs/>
+          <w:color w:val="1F2937"/>
+          <w:sz w:val="22"/>
+          <w:szCs w:val="22"/>
+        </w:rPr>
+        <w:t xml:space="preserve">• </w:t>
+      </w:r>
+      <w:r>
+        <w:rPr>
+          <w:rFonts w:ascii="Calibri" w:cs="Calibri" w:eastAsia="Calibri" w:hAnsi="Calibri"/>
+          <w:color w:val="374151"/>
+          <w:sz w:val="22"/>
+          <w:szCs w:val="22"/>
+        </w:rPr>
+        <w:t xml:space="preserve">Subquery with IN: Retrieves customers who have placed at least one confirmed booking.</w:t>
+      </w:r>
+    </w:p>
+    <w:p>
+      <w:pPr>
+        <w:pStyle w:val="ListParagraph"/>
+        <w:numPr>
+          <w:ilvl w:val="0"/>
+          <w:numId w:val="1"/>
+        </w:numPr>
+        <w:spacing w:after="60" w:before="60" w:line="260"/>
+      </w:pPr>
+      <w:r>
+        <w:rPr>
+          <w:rFonts w:ascii="Calibri" w:cs="Calibri" w:eastAsia="Calibri" w:hAnsi="Calibri"/>
+          <w:b/>
+          <w:bCs/>
+          <w:color w:val="1F2937"/>
+          <w:sz w:val="22"/>
+          <w:szCs w:val="22"/>
+        </w:rPr>
+        <w:t xml:space="preserve">• </w:t>
+      </w:r>
+      <w:r>
+        <w:rPr>
+          <w:rFonts w:ascii="Calibri" w:cs="Calibri" w:eastAsia="Calibri" w:hAnsi="Calibri"/>
+          <w:color w:val="374151"/>
+          <w:sz w:val="22"/>
+          <w:szCs w:val="22"/>
+        </w:rPr>
+        <w:t xml:space="preserve">Subquery with NOT IN: Identifies cafe tables that have never been reserved.</w:t>
+      </w:r>
+    </w:p>
+    <w:p>
+      <w:pPr>
+        <w:pStyle w:val="ListParagraph"/>
+        <w:numPr>
+          <w:ilvl w:val="0"/>
+          <w:numId w:val="1"/>
+        </w:numPr>
+        <w:spacing w:after="60" w:before="60" w:line="260"/>
+      </w:pPr>
+      <w:r>
+        <w:rPr>
+          <w:rFonts w:ascii="Calibri" w:cs="Calibri" w:eastAsia="Calibri" w:hAnsi="Calibri"/>
+          <w:b/>
+          <w:bCs/>
+          <w:color w:val="1F2937"/>
+          <w:sz w:val="22"/>
+          <w:szCs w:val="22"/>
+        </w:rPr>
+        <w:t xml:space="preserve">• </w:t>
+      </w:r>
+      <w:r>
+        <w:rPr>
+          <w:rFonts w:ascii="Calibri" w:cs="Calibri" w:eastAsia="Calibri" w:hAnsi="Calibri"/>
+          <w:color w:val="374151"/>
+          <w:sz w:val="22"/>
+          <w:szCs w:val="22"/>
+        </w:rPr>
+        <w:t xml:space="preserve">Aggregate Subquery: Extracts all menu items priced strictly higher than the average menu price.</w:t>
+      </w:r>
+    </w:p>
+    <w:p>
+      <w:pPr>
+        <w:pStyle w:val="ListParagraph"/>
+        <w:numPr>
+          <w:ilvl w:val="0"/>
+          <w:numId w:val="1"/>
+        </w:numPr>
+        <w:spacing w:after="60" w:before="60" w:line="260"/>
+      </w:pPr>
+      <w:r>
+        <w:rPr>
+          <w:rFonts w:ascii="Calibri" w:cs="Calibri" w:eastAsia="Calibri" w:hAnsi="Calibri"/>
+          <w:b/>
+          <w:bCs/>
+          <w:color w:val="1F2937"/>
+          <w:sz w:val="22"/>
+          <w:szCs w:val="22"/>
+        </w:rPr>
+        <w:t xml:space="preserve">• </w:t>
+      </w:r>
+      <w:r>
+        <w:rPr>
+          <w:rFonts w:ascii="Calibri" w:cs="Calibri" w:eastAsia="Calibri" w:hAnsi="Calibri"/>
+          <w:color w:val="374151"/>
+          <w:sz w:val="22"/>
+          <w:szCs w:val="22"/>
+        </w:rPr>
+        <w:t xml:space="preserve">Correlated Subquery with EXISTS: Validates customer reservation history dynamically.</w:t>
+      </w:r>
+    </w:p>
+    <w:p>
+      <w:pPr>
+        <w:pStyle w:val="Heading2"/>
+        <w:spacing w:after="120" w:before="240"/>
+      </w:pPr>
+      <w:r>
+        <w:rPr>
+          <w:rFonts w:ascii="Calibri" w:cs="Calibri" w:eastAsia="Calibri" w:hAnsi="Calibri"/>
+          <w:b/>
+          <w:bCs/>
+          <w:color w:val="3B82F6"/>
+          <w:sz w:val="26"/>
+          <w:szCs w:val="26"/>
+        </w:rPr>
+        <w:t xml:space="preserve">4.7 Practical 7: Database Views</w:t>
+      </w:r>
+    </w:p>
+    <w:p>
+      <w:pPr>
+        <w:pStyle w:val="ListParagraph"/>
+        <w:numPr>
+          <w:ilvl w:val="0"/>
+          <w:numId w:val="1"/>
+        </w:numPr>
+        <w:spacing w:after="60" w:before="60" w:line="260"/>
+      </w:pPr>
+      <w:r>
+        <w:rPr>
+          <w:rFonts w:ascii="Calibri" w:cs="Calibri" w:eastAsia="Calibri" w:hAnsi="Calibri"/>
+          <w:b/>
+          <w:bCs/>
+          <w:color w:val="1F2937"/>
+          <w:sz w:val="22"/>
+          <w:szCs w:val="22"/>
+        </w:rPr>
+        <w:t xml:space="preserve">(a) </w:t>
+      </w:r>
+      <w:r>
+        <w:rPr>
+          <w:rFonts w:ascii="Calibri" w:cs="Calibri" w:eastAsia="Calibri" w:hAnsi="Calibri"/>
+          <w:color w:val="374151"/>
+          <w:sz w:val="22"/>
+          <w:szCs w:val="22"/>
+        </w:rPr>
+        <w:t xml:space="preserve">Simple View (`v_available_tables`): Filtered abstraction exposing only currently free tables.</w:t>
+      </w:r>
+    </w:p>
+    <w:p>
+      <w:pPr>
+        <w:pStyle w:val="ListParagraph"/>
+        <w:numPr>
+          <w:ilvl w:val="0"/>
+          <w:numId w:val="1"/>
+        </w:numPr>
+        <w:spacing w:after="60" w:before="60" w:line="260"/>
+      </w:pPr>
+      <w:r>
+        <w:rPr>
+          <w:rFonts w:ascii="Calibri" w:cs="Calibri" w:eastAsia="Calibri" w:hAnsi="Calibri"/>
+          <w:b/>
+          <w:bCs/>
+          <w:color w:val="1F2937"/>
+          <w:sz w:val="22"/>
+          <w:szCs w:val="22"/>
+        </w:rPr>
+        <w:t xml:space="preserve">(b) </w:t>
+      </w:r>
+      <w:r>
+        <w:rPr>
+          <w:rFonts w:ascii="Calibri" w:cs="Calibri" w:eastAsia="Calibri" w:hAnsi="Calibri"/>
+          <w:color w:val="374151"/>
+          <w:sz w:val="22"/>
+          <w:szCs w:val="22"/>
+        </w:rPr>
+        <w:t xml:space="preserve">Join View (`v_admin_bookings_report`): Pre-computed multi-table join view across Bookings, Customers, and Tables.</w:t>
+      </w:r>
+    </w:p>
+    <w:p>
+      <w:pPr>
+        <w:pStyle w:val="ListParagraph"/>
+        <w:numPr>
+          <w:ilvl w:val="0"/>
+          <w:numId w:val="1"/>
+        </w:numPr>
+        <w:spacing w:after="60" w:before="60" w:line="260"/>
+      </w:pPr>
+      <w:r>
+        <w:rPr>
+          <w:rFonts w:ascii="Calibri" w:cs="Calibri" w:eastAsia="Calibri" w:hAnsi="Calibri"/>
+          <w:b/>
+          <w:bCs/>
+          <w:color w:val="1F2937"/>
+          <w:sz w:val="22"/>
+          <w:szCs w:val="22"/>
+        </w:rPr>
+        <w:t xml:space="preserve">(c) </w:t>
+      </w:r>
+      <w:r>
+        <w:rPr>
+          <w:rFonts w:ascii="Calibri" w:cs="Calibri" w:eastAsia="Calibri" w:hAnsi="Calibri"/>
+          <w:color w:val="374151"/>
+          <w:sz w:val="22"/>
+          <w:szCs w:val="22"/>
+        </w:rPr>
+        <w:t xml:space="preserve">View with CHECK OPTION (`v_active_beverages`): Enforces that updates through the view must satisfy category and availability criteria.</w:t>
+      </w:r>
+    </w:p>
+    <w:p>
+      <w:pPr>
+        <w:pStyle w:val="Heading2"/>
+        <w:spacing w:after="120" w:before="240"/>
+      </w:pPr>
+      <w:r>
+        <w:rPr>
+          <w:rFonts w:ascii="Calibri" w:cs="Calibri" w:eastAsia="Calibri" w:hAnsi="Calibri"/>
+          <w:b/>
+          <w:bCs/>
+          <w:color w:val="3B82F6"/>
+          <w:sz w:val="26"/>
+          <w:szCs w:val="26"/>
+        </w:rPr>
+        <w:t xml:space="preserve">4.8 Practical 8: Transaction Control Language (TCL)</w:t>
+      </w:r>
+    </w:p>
+    <w:p>
+      <w:pPr>
+        <w:spacing w:after="120" w:before="120" w:line="276"/>
+        <w:jc w:val="left"/>
+      </w:pPr>
+      <w:r>
+        <w:rPr>
+          <w:rFonts w:ascii="Calibri" w:cs="Calibri" w:eastAsia="Calibri" w:hAnsi="Calibri"/>
+          <w:b w:val="false"/>
+          <w:bCs w:val="false"/>
+          <w:i w:val="false"/>
+          <w:iCs w:val="false"/>
+          <w:color w:val="1F2937"/>
+          <w:sz w:val="22"/>
+          <w:szCs w:val="22"/>
+        </w:rPr>
+        <w:t xml:space="preserve">Ensures ACID properties during dining transactions (in `checkout.php` and `book.php`):</w:t>
+      </w:r>
+    </w:p>
+    <w:p>
+      <w:pPr>
+        <w:pStyle w:val="ListParagraph"/>
+        <w:numPr>
+          <w:ilvl w:val="0"/>
+          <w:numId w:val="1"/>
+        </w:numPr>
+        <w:spacing w:after="60" w:before="60" w:line="260"/>
+      </w:pPr>
+      <w:r>
+        <w:rPr>
+          <w:rFonts w:ascii="Calibri" w:cs="Calibri" w:eastAsia="Calibri" w:hAnsi="Calibri"/>
+          <w:b/>
+          <w:bCs/>
+          <w:color w:val="1F2937"/>
+          <w:sz w:val="22"/>
+          <w:szCs w:val="22"/>
+        </w:rPr>
+        <w:t xml:space="preserve">• </w:t>
+      </w:r>
+      <w:r>
+        <w:rPr>
+          <w:rFonts w:ascii="Calibri" w:cs="Calibri" w:eastAsia="Calibri" w:hAnsi="Calibri"/>
+          <w:color w:val="374151"/>
+          <w:sz w:val="22"/>
+          <w:szCs w:val="22"/>
+        </w:rPr>
+        <w:t xml:space="preserve">START TRANSACTION: Initiates atomic execution boundary.</w:t>
+      </w:r>
+    </w:p>
+    <w:p>
+      <w:pPr>
+        <w:pStyle w:val="ListParagraph"/>
+        <w:numPr>
+          <w:ilvl w:val="0"/>
+          <w:numId w:val="1"/>
+        </w:numPr>
+        <w:spacing w:after="60" w:before="60" w:line="260"/>
+      </w:pPr>
+      <w:r>
+        <w:rPr>
+          <w:rFonts w:ascii="Calibri" w:cs="Calibri" w:eastAsia="Calibri" w:hAnsi="Calibri"/>
+          <w:b/>
+          <w:bCs/>
+          <w:color w:val="1F2937"/>
+          <w:sz w:val="22"/>
+          <w:szCs w:val="22"/>
+        </w:rPr>
+        <w:t xml:space="preserve">• </w:t>
+      </w:r>
+      <w:r>
+        <w:rPr>
+          <w:rFonts w:ascii="Calibri" w:cs="Calibri" w:eastAsia="Calibri" w:hAnsi="Calibri"/>
+          <w:color w:val="374151"/>
+          <w:sz w:val="22"/>
+          <w:szCs w:val="22"/>
+        </w:rPr>
+        <w:t xml:space="preserve">SAVEPOINT: Sets intermediate checkpoints during order item iteration.</w:t>
+      </w:r>
+    </w:p>
+    <w:p>
+      <w:pPr>
+        <w:pStyle w:val="ListParagraph"/>
+        <w:numPr>
+          <w:ilvl w:val="0"/>
+          <w:numId w:val="1"/>
+        </w:numPr>
+        <w:spacing w:after="60" w:before="60" w:line="260"/>
+      </w:pPr>
+      <w:r>
+        <w:rPr>
+          <w:rFonts w:ascii="Calibri" w:cs="Calibri" w:eastAsia="Calibri" w:hAnsi="Calibri"/>
+          <w:b/>
+          <w:bCs/>
+          <w:color w:val="1F2937"/>
+          <w:sz w:val="22"/>
+          <w:szCs w:val="22"/>
+        </w:rPr>
+        <w:t xml:space="preserve">• </w:t>
+      </w:r>
+      <w:r>
+        <w:rPr>
+          <w:rFonts w:ascii="Calibri" w:cs="Calibri" w:eastAsia="Calibri" w:hAnsi="Calibri"/>
+          <w:color w:val="374151"/>
+          <w:sz w:val="22"/>
+          <w:szCs w:val="22"/>
+        </w:rPr>
+        <w:t xml:space="preserve">ROLLBACK: Reverts state if item validation fails or an exception is caught.</w:t>
+      </w:r>
+    </w:p>
+    <w:p>
+      <w:pPr>
+        <w:pStyle w:val="ListParagraph"/>
+        <w:numPr>
+          <w:ilvl w:val="0"/>
+          <w:numId w:val="1"/>
+        </w:numPr>
+        <w:spacing w:after="60" w:before="60" w:line="260"/>
+      </w:pPr>
+      <w:r>
+        <w:rPr>
+          <w:rFonts w:ascii="Calibri" w:cs="Calibri" w:eastAsia="Calibri" w:hAnsi="Calibri"/>
+          <w:b/>
+          <w:bCs/>
+          <w:color w:val="1F2937"/>
+          <w:sz w:val="22"/>
+          <w:szCs w:val="22"/>
+        </w:rPr>
+        <w:t xml:space="preserve">• </w:t>
+      </w:r>
+      <w:r>
+        <w:rPr>
+          <w:rFonts w:ascii="Calibri" w:cs="Calibri" w:eastAsia="Calibri" w:hAnsi="Calibri"/>
+          <w:color w:val="374151"/>
+          <w:sz w:val="22"/>
+          <w:szCs w:val="22"/>
+        </w:rPr>
+        <w:t xml:space="preserve">COMMIT: Finalizes and permanently writes order headers, order line items, and audit records.</w:t>
+      </w:r>
+    </w:p>
+    <w:p>
+      <w:pPr>
+        <w:pStyle w:val="Heading2"/>
+        <w:spacing w:after="120" w:before="240"/>
+      </w:pPr>
+      <w:r>
+        <w:rPr>
+          <w:rFonts w:ascii="Calibri" w:cs="Calibri" w:eastAsia="Calibri" w:hAnsi="Calibri"/>
+          <w:b/>
+          <w:bCs/>
+          <w:color w:val="3B82F6"/>
+          <w:sz w:val="26"/>
+          <w:szCs w:val="26"/>
+        </w:rPr>
+        <w:t xml:space="preserve">4.9 Practical 9: Data Control Language (DCL)</w:t>
+      </w:r>
+    </w:p>
+    <w:p>
+      <w:pPr>
+        <w:spacing w:after="120" w:before="120" w:line="276"/>
+        <w:jc w:val="left"/>
+      </w:pPr>
+      <w:r>
+        <w:rPr>
+          <w:rFonts w:ascii="Calibri" w:cs="Calibri" w:eastAsia="Calibri" w:hAnsi="Calibri"/>
+          <w:b w:val="false"/>
+          <w:bCs w:val="false"/>
+          <w:i w:val="false"/>
+          <w:iCs w:val="false"/>
+          <w:color w:val="1F2937"/>
+          <w:sz w:val="22"/>
+          <w:szCs w:val="22"/>
+        </w:rPr>
+        <w:t xml:space="preserve">Access control and security privilege management demonstrated in the database:</w:t>
+      </w:r>
+    </w:p>
+    <w:p>
+      <w:pPr>
+        <w:pStyle w:val="ListParagraph"/>
+        <w:numPr>
+          <w:ilvl w:val="0"/>
+          <w:numId w:val="1"/>
+        </w:numPr>
+        <w:spacing w:after="60" w:before="60" w:line="260"/>
+      </w:pPr>
+      <w:r>
+        <w:rPr>
+          <w:rFonts w:ascii="Calibri" w:cs="Calibri" w:eastAsia="Calibri" w:hAnsi="Calibri"/>
+          <w:b/>
+          <w:bCs/>
+          <w:color w:val="1F2937"/>
+          <w:sz w:val="22"/>
+          <w:szCs w:val="22"/>
+        </w:rPr>
+        <w:t xml:space="preserve">• </w:t>
+      </w:r>
+      <w:r>
+        <w:rPr>
+          <w:rFonts w:ascii="Calibri" w:cs="Calibri" w:eastAsia="Calibri" w:hAnsi="Calibri"/>
+          <w:color w:val="374151"/>
+          <w:sz w:val="22"/>
+          <w:szCs w:val="22"/>
+        </w:rPr>
+        <w:t xml:space="preserve">GRANT SELECT, INSERT ON cafe_orders TO 'cafe_waiter'@'localhost';</w:t>
+      </w:r>
+    </w:p>
+    <w:p>
+      <w:pPr>
+        <w:pStyle w:val="ListParagraph"/>
+        <w:numPr>
+          <w:ilvl w:val="0"/>
+          <w:numId w:val="1"/>
+        </w:numPr>
+        <w:spacing w:after="60" w:before="60" w:line="260"/>
+      </w:pPr>
+      <w:r>
+        <w:rPr>
+          <w:rFonts w:ascii="Calibri" w:cs="Calibri" w:eastAsia="Calibri" w:hAnsi="Calibri"/>
+          <w:b/>
+          <w:bCs/>
+          <w:color w:val="1F2937"/>
+          <w:sz w:val="22"/>
+          <w:szCs w:val="22"/>
+        </w:rPr>
+        <w:t xml:space="preserve">• </w:t>
+      </w:r>
+      <w:r>
+        <w:rPr>
+          <w:rFonts w:ascii="Calibri" w:cs="Calibri" w:eastAsia="Calibri" w:hAnsi="Calibri"/>
+          <w:color w:val="374151"/>
+          <w:sz w:val="22"/>
+          <w:szCs w:val="22"/>
+        </w:rPr>
+        <w:t xml:space="preserve">REVOKE UPDATE ON cafe_orders FROM 'cafe_waiter'@'localhost';</w:t>
+      </w:r>
+    </w:p>
+    <w:p>
+      <w:pPr>
+        <w:pStyle w:val="Heading2"/>
+        <w:spacing w:after="120" w:before="240"/>
+      </w:pPr>
+      <w:r>
+        <w:rPr>
+          <w:rFonts w:ascii="Calibri" w:cs="Calibri" w:eastAsia="Calibri" w:hAnsi="Calibri"/>
+          <w:b/>
+          <w:bCs/>
+          <w:color w:val="3B82F6"/>
+          <w:sz w:val="26"/>
+          <w:szCs w:val="26"/>
+        </w:rPr>
+        <w:t xml:space="preserve">4.10 Practical 10: Database Triggers</w:t>
+      </w:r>
+    </w:p>
+    <w:p>
+      <w:pPr>
+        <w:pStyle w:val="ListParagraph"/>
+        <w:numPr>
+          <w:ilvl w:val="0"/>
+          <w:numId w:val="1"/>
+        </w:numPr>
+        <w:spacing w:after="60" w:before="60" w:line="260"/>
+      </w:pPr>
+      <w:r>
+        <w:rPr>
+          <w:rFonts w:ascii="Calibri" w:cs="Calibri" w:eastAsia="Calibri" w:hAnsi="Calibri"/>
+          <w:b/>
+          <w:bCs/>
+          <w:color w:val="1F2937"/>
+          <w:sz w:val="22"/>
+          <w:szCs w:val="22"/>
+        </w:rPr>
+        <w:t xml:space="preserve">(a) </w:t>
+      </w:r>
+      <w:r>
+        <w:rPr>
+          <w:rFonts w:ascii="Calibri" w:cs="Calibri" w:eastAsia="Calibri" w:hAnsi="Calibri"/>
+          <w:color w:val="374151"/>
+          <w:sz w:val="22"/>
+          <w:szCs w:val="22"/>
+        </w:rPr>
+        <w:t xml:space="preserve">DML Operation Audit Trigger (`trg_audit_orders_insert` &amp; `trg_audit_orders_update`): Automatically logs all INSERT and UPDATE operations on cafe orders directly into the `AUDIT_LOG` relation.</w:t>
+      </w:r>
+    </w:p>
+    <w:p>
+      <w:pPr>
+        <w:pStyle w:val="ListParagraph"/>
+        <w:numPr>
+          <w:ilvl w:val="0"/>
+          <w:numId w:val="1"/>
+        </w:numPr>
+        <w:spacing w:after="60" w:before="60" w:line="260"/>
+      </w:pPr>
+      <w:r>
+        <w:rPr>
+          <w:rFonts w:ascii="Calibri" w:cs="Calibri" w:eastAsia="Calibri" w:hAnsi="Calibri"/>
+          <w:b/>
+          <w:bCs/>
+          <w:color w:val="1F2937"/>
+          <w:sz w:val="22"/>
+          <w:szCs w:val="22"/>
+        </w:rPr>
+        <w:t xml:space="preserve">(b) </w:t>
+      </w:r>
+      <w:r>
+        <w:rPr>
+          <w:rFonts w:ascii="Calibri" w:cs="Calibri" w:eastAsia="Calibri" w:hAnsi="Calibri"/>
+          <w:color w:val="374151"/>
+          <w:sz w:val="22"/>
+          <w:szCs w:val="22"/>
+        </w:rPr>
+        <w:t xml:space="preserve">Validation Trigger with Message Alert (`trg_check_customer_age`): Evaluates customer age upon reservation creation. If `age &lt; 18`, the trigger automatically aborts the transaction with an alert message: 'AGE ALERT: Customer must be at least 18 years old to make a cafe table reservation.'</w:t>
+      </w:r>
+    </w:p>
+    <w:p>
+      <w:pPr>
+        <w:pStyle w:val="Heading2"/>
+        <w:spacing w:after="120" w:before="240"/>
+      </w:pPr>
+      <w:r>
+        <w:rPr>
+          <w:rFonts w:ascii="Calibri" w:cs="Calibri" w:eastAsia="Calibri" w:hAnsi="Calibri"/>
+          <w:b/>
+          <w:bCs/>
+          <w:color w:val="3B82F6"/>
+          <w:sz w:val="26"/>
+          <w:szCs w:val="26"/>
+        </w:rPr>
+        <w:t xml:space="preserve">4.11 Practical 11: Mini Project Database &amp; ERP Model Implementation</w:t>
+      </w:r>
+    </w:p>
+    <w:p>
+      <w:pPr>
+        <w:spacing w:after="120" w:before="120" w:line="276"/>
+        <w:jc w:val="left"/>
+      </w:pPr>
+      <w:r>
+        <w:rPr>
+          <w:rFonts w:ascii="Calibri" w:cs="Calibri" w:eastAsia="Calibri" w:hAnsi="Calibri"/>
+          <w:b w:val="false"/>
+          <w:bCs w:val="false"/>
+          <w:i w:val="false"/>
+          <w:iCs w:val="false"/>
+          <w:color w:val="1F2937"/>
+          <w:sz w:val="22"/>
+          <w:szCs w:val="22"/>
+        </w:rPr>
+        <w:t xml:space="preserve">Complete production database implementation for the QR Cafe Smart Dining System provided in pure MySQL syntax (`mysql_11_practicals.sql`) and SQLite (`schema_11_practicals.sql`).</w:t>
+      </w:r>
+    </w:p>
     <w:p>
       <w:r>
         <w:br w:type="page"/>
@@ -9290,6 +10611,139 @@
     <w:basedOn w:val="Normal"/>
     <w:qFormat/>
   </w:style>
+  <w:style w:type="paragraph" w:styleId="Caption">
+    <w:name w:val="caption"/>
+    <w:basedOn w:val="Normal"/>
+    <w:next w:val="Normal"/>
+    <w:uiPriority w:val="35"/>
+    <w:semiHidden/>
+    <w:unhideWhenUsed/>
+    <w:qFormat/>
+    <w:pPr>
+      <w:spacing w:after="200"/>
+    </w:pPr>
+    <w:rPr>
+      <w:i/>
+      <w:iCs/>
+      <w:color w:val="44546A" w:themeColor="dark2"/>
+      <w:sz w:val="18"/>
+      <w:szCs w:val="18"/>
+    </w:rPr>
+  </w:style>
+  <w:style w:type="paragraph" w:styleId="Bibliography">
+    <w:name w:val="Bibliography"/>
+    <w:basedOn w:val="Normal"/>
+    <w:next w:val="Normal"/>
+    <w:uiPriority w:val="37"/>
+    <w:unhideWhenUsed/>
+  </w:style>
+  <w:style w:type="paragraph" w:styleId="TOC1">
+    <w:name w:val="toc 1"/>
+    <w:basedOn w:val="Normal"/>
+    <w:next w:val="Normal"/>
+    <w:uiPriority w:val="39"/>
+    <w:semiHidden/>
+    <w:unhideWhenUsed/>
+    <w:pPr>
+      <w:spacing w:after="100"/>
+    </w:pPr>
+  </w:style>
+  <w:style w:type="paragraph" w:styleId="TOC2">
+    <w:name w:val="toc 2"/>
+    <w:basedOn w:val="Normal"/>
+    <w:next w:val="Normal"/>
+    <w:uiPriority w:val="39"/>
+    <w:semiHidden/>
+    <w:unhideWhenUsed/>
+    <w:pPr>
+      <w:spacing w:after="100"/>
+      <w:ind w:left="200"/>
+    </w:pPr>
+  </w:style>
+  <w:style w:type="paragraph" w:styleId="TOC3">
+    <w:name w:val="toc 3"/>
+    <w:basedOn w:val="Normal"/>
+    <w:next w:val="Normal"/>
+    <w:uiPriority w:val="39"/>
+    <w:semiHidden/>
+    <w:unhideWhenUsed/>
+    <w:pPr>
+      <w:spacing w:after="100"/>
+      <w:ind w:left="400"/>
+    </w:pPr>
+  </w:style>
+  <w:style w:type="paragraph" w:styleId="TOC4">
+    <w:name w:val="toc 4"/>
+    <w:basedOn w:val="Normal"/>
+    <w:next w:val="Normal"/>
+    <w:uiPriority w:val="39"/>
+    <w:semiHidden/>
+    <w:unhideWhenUsed/>
+    <w:pPr>
+      <w:spacing w:after="100"/>
+      <w:ind w:left="600"/>
+    </w:pPr>
+  </w:style>
+  <w:style w:type="paragraph" w:styleId="TOC5">
+    <w:name w:val="toc 5"/>
+    <w:basedOn w:val="Normal"/>
+    <w:next w:val="Normal"/>
+    <w:uiPriority w:val="39"/>
+    <w:semiHidden/>
+    <w:unhideWhenUsed/>
+    <w:pPr>
+      <w:spacing w:after="100"/>
+      <w:ind w:left="800"/>
+    </w:pPr>
+  </w:style>
+  <w:style w:type="paragraph" w:styleId="TOC6">
+    <w:name w:val="toc 6"/>
+    <w:basedOn w:val="Normal"/>
+    <w:next w:val="Normal"/>
+    <w:uiPriority w:val="39"/>
+    <w:semiHidden/>
+    <w:unhideWhenUsed/>
+    <w:pPr>
+      <w:spacing w:after="100"/>
+      <w:ind w:left="1000"/>
+    </w:pPr>
+  </w:style>
+  <w:style w:type="paragraph" w:styleId="TOC7">
+    <w:name w:val="toc 7"/>
+    <w:basedOn w:val="Normal"/>
+    <w:next w:val="Normal"/>
+    <w:uiPriority w:val="39"/>
+    <w:semiHidden/>
+    <w:unhideWhenUsed/>
+    <w:pPr>
+      <w:spacing w:after="100"/>
+      <w:ind w:left="1200"/>
+    </w:pPr>
+  </w:style>
+  <w:style w:type="paragraph" w:styleId="TOC8">
+    <w:name w:val="toc 8"/>
+    <w:basedOn w:val="Normal"/>
+    <w:next w:val="Normal"/>
+    <w:uiPriority w:val="39"/>
+    <w:semiHidden/>
+    <w:unhideWhenUsed/>
+    <w:pPr>
+      <w:spacing w:after="100"/>
+      <w:ind w:left="1400"/>
+    </w:pPr>
+  </w:style>
+  <w:style w:type="paragraph" w:styleId="TOC9">
+    <w:name w:val="toc 9"/>
+    <w:basedOn w:val="Normal"/>
+    <w:next w:val="Normal"/>
+    <w:uiPriority w:val="39"/>
+    <w:semiHidden/>
+    <w:unhideWhenUsed/>
+    <w:pPr>
+      <w:spacing w:after="100"/>
+      <w:ind w:left="1600"/>
+    </w:pPr>
+  </w:style>
   <w:style w:type="character" w:styleId="Hyperlink">
     <w:name w:val="Hyperlink"/>
     <w:basedOn w:val="DefaultParagraphFont"/>
@@ -9373,6 +10827,13 @@
       <w:sz w:val="20"/>
       <w:szCs w:val="20"/>
     </w:rPr>
+  </w:style>
+  <w:style w:type="character" w:styleId="LineNumber">
+    <w:name w:val="line number"/>
+    <w:basedOn w:val="DefaultParagraphFont"/>
+    <w:uiPriority w:val="99"/>
+    <w:semiHidden/>
+    <w:unhideWhenUsed/>
   </w:style>
 </w:styles>
 </file>

</xml_diff>